<commit_message>
docs: Cap nhat DanhMucKhoa.docx theo KhoaController cua BE moi
</commit_message>
<xml_diff>
--- a/DanhMucKhoa.docx
+++ b/DanhMucKhoa.docx
@@ -35,7 +35,7 @@
           <w:rFonts w:ascii="Times New Roman" w:hAnsi="Times New Roman" w:cs="Times New Roman"/>
           <w:sz w:val="26"/>
         </w:rPr>
-        <w:t>Tài liệu này trình bày chi tiết về quá trình thiết kế cơ sở dữ liệu, xây dựng các API ở Backend và hoàn thiện giao diện Quản lý Danh mục Khoa phòng phía Frontend. Chức năng này giúp số hóa cơ cấu tổ chức khoa phòng trong phòng khám đa khoa, thay thế trường Chuyên môn dạng chữ tự do bằng một danh mục độc lập được chuẩn hóa và liên kết chặt chẽ.</w:t>
+        <w:t>Tài liệu này trình bày chi tiết về cấu trúc cơ sở dữ liệu, mã nguồn API phía Backend (C# .NET) và giao diện Quản lý Danh mục Khoa phòng phía Frontend (ReactJS). Chức năng này giúp số hóa cơ cấu tổ chức khoa phòng trong phòng khám đa khoa, đồng thời liên kết động danh sách Bác sĩ trực thuộc từng khoa theo thời gian thực.</w:t>
       </w:r>
     </w:p>
     <w:p>
@@ -136,7 +136,7 @@
           <w:rFonts w:ascii="Courier New" w:hAnsi="Courier New" w:cs="Courier New"/>
           <w:sz w:val="20"/>
         </w:rPr>
-        <w:t xml:space="preserve">    TenKhoa NVARCHAR(100) NOT NULL</w:t>
+        <w:t xml:space="preserve">    TenKhoa NVARCHAR(100) NOT NULL UNIQUE</w:t>
       </w:r>
     </w:p>
     <w:p>
@@ -744,7 +744,7 @@
           <w:b/>
           <w:sz w:val="26"/>
         </w:rPr>
-        <w:t>2.3. Bộ điều khiển API DanhMucKhoaController.cs</w:t>
+        <w:t>2.3. Bộ điều khiển API KhoaController.cs</w:t>
       </w:r>
     </w:p>
     <w:p>
@@ -786,14 +786,14 @@
           <w:b/>
           <w:sz w:val="26"/>
         </w:rPr>
-        <w:t xml:space="preserve">GET api/DanhMucKhoa: </w:t>
-      </w:r>
-      <w:r>
-        <w:rPr>
-          <w:rFonts w:ascii="Times New Roman" w:hAnsi="Times New Roman" w:cs="Times New Roman"/>
-          <w:sz w:val="26"/>
-        </w:rPr>
-        <w:t>Hỗ trợ tìm kiếm theo từ khóa và phân trang phía máy chủ.</w:t>
+        <w:t xml:space="preserve">GET api/Khoa: </w:t>
+      </w:r>
+      <w:r>
+        <w:rPr>
+          <w:rFonts w:ascii="Times New Roman" w:hAnsi="Times New Roman" w:cs="Times New Roman"/>
+          <w:sz w:val="26"/>
+        </w:rPr>
+        <w:t>Hỗ trợ tìm kiếm theo từ khóa và phân trang phía máy chủ. Đồng thời join với bảng NhanVien để đếm số bác sĩ hoạt động trong khoa.</w:t>
       </w:r>
     </w:p>
     <w:p>
@@ -818,14 +818,14 @@
           <w:b/>
           <w:sz w:val="26"/>
         </w:rPr>
-        <w:t xml:space="preserve">POST api/DanhMucKhoa: </w:t>
-      </w:r>
-      <w:r>
-        <w:rPr>
-          <w:rFonts w:ascii="Times New Roman" w:hAnsi="Times New Roman" w:cs="Times New Roman"/>
-          <w:sz w:val="26"/>
-        </w:rPr>
-        <w:t>Thêm mới khoa phòng mới với kiểm tra trùng mã.</w:t>
+        <w:t xml:space="preserve">GET api/Khoa/{maKhoa}/BacSi: </w:t>
+      </w:r>
+      <w:r>
+        <w:rPr>
+          <w:rFonts w:ascii="Times New Roman" w:hAnsi="Times New Roman" w:cs="Times New Roman"/>
+          <w:sz w:val="26"/>
+        </w:rPr>
+        <w:t>Lấy danh sách các bác sĩ thuộc khoa chuyên môn tương ứng.</w:t>
       </w:r>
     </w:p>
     <w:p>
@@ -850,14 +850,14 @@
           <w:b/>
           <w:sz w:val="26"/>
         </w:rPr>
-        <w:t xml:space="preserve">PUT api/DanhMucKhoa/{id}: </w:t>
-      </w:r>
-      <w:r>
-        <w:rPr>
-          <w:rFonts w:ascii="Times New Roman" w:hAnsi="Times New Roman" w:cs="Times New Roman"/>
-          <w:sz w:val="26"/>
-        </w:rPr>
-        <w:t>Cập nhật tên khoa phòng theo mã định danh chính xác.</w:t>
+        <w:t xml:space="preserve">POST api/Khoa: </w:t>
+      </w:r>
+      <w:r>
+        <w:rPr>
+          <w:rFonts w:ascii="Times New Roman" w:hAnsi="Times New Roman" w:cs="Times New Roman"/>
+          <w:sz w:val="26"/>
+        </w:rPr>
+        <w:t>Thêm mới khoa phòng mới với kiểm tra trùng mã và kiểm tra ký tự đặc biệt.</w:t>
       </w:r>
     </w:p>
     <w:p>
@@ -882,14 +882,46 @@
           <w:b/>
           <w:sz w:val="26"/>
         </w:rPr>
-        <w:t xml:space="preserve">DELETE api/DanhMucKhoa/{id}: </w:t>
-      </w:r>
-      <w:r>
-        <w:rPr>
-          <w:rFonts w:ascii="Times New Roman" w:hAnsi="Times New Roman" w:cs="Times New Roman"/>
-          <w:sz w:val="26"/>
-        </w:rPr>
-        <w:t>Xóa khoa phòng khỏi hệ thống nếu không có ràng buộc dữ liệu.</w:t>
+        <w:t xml:space="preserve">PUT api/Khoa/{maKhoa}: </w:t>
+      </w:r>
+      <w:r>
+        <w:rPr>
+          <w:rFonts w:ascii="Times New Roman" w:hAnsi="Times New Roman" w:cs="Times New Roman"/>
+          <w:sz w:val="26"/>
+        </w:rPr>
+        <w:t>Cập nhật tên khoa phòng theo mã định danh chính xác (không cho phép sửa mã khoa).</w:t>
+      </w:r>
+    </w:p>
+    <w:p>
+      <w:pPr>
+        <w:spacing w:after="80" w:line="240" w:lineRule="auto"/>
+        <w:jc w:val="both"/>
+        <w:rPr>
+          <w:rFonts w:ascii="Times New Roman" w:hAnsi="Times New Roman" w:cs="Times New Roman"/>
+          <w:sz w:val="26"/>
+        </w:rPr>
+      </w:pPr>
+      <w:r>
+        <w:rPr>
+          <w:rFonts w:ascii="Times New Roman" w:hAnsi="Times New Roman" w:cs="Times New Roman"/>
+          <w:sz w:val="26"/>
+        </w:rPr>
+        <w:t xml:space="preserve">   â€¢   </w:t>
+      </w:r>
+      <w:r>
+        <w:rPr>
+          <w:rFonts w:ascii="Times New Roman" w:hAnsi="Times New Roman" w:cs="Times New Roman"/>
+          <w:b/>
+          <w:sz w:val="26"/>
+        </w:rPr>
+        <w:t xml:space="preserve">DELETE api/Khoa/{maKhoa}: </w:t>
+      </w:r>
+      <w:r>
+        <w:rPr>
+          <w:rFonts w:ascii="Times New Roman" w:hAnsi="Times New Roman" w:cs="Times New Roman"/>
+          <w:sz w:val="26"/>
+        </w:rPr>
+        <w:t>Xóa khoa phòng khỏi hệ thống nếu không có nhân viên nào đang trực thuộc (chống lỗi khóa ngoại).</w:t>
       </w:r>
     </w:p>
     <w:p>
@@ -1054,7 +1086,7 @@
           <w:rFonts w:ascii="Courier New" w:hAnsi="Courier New" w:cs="Courier New"/>
           <w:sz w:val="20"/>
         </w:rPr>
-        <w:t xml:space="preserve">  return await apiFetch(`/DanhMucKhoa?${query.toString()}`);</w:t>
+        <w:t xml:space="preserve">  return await apiFetch(`/Khoa?${query.toString()}`);</w:t>
       </w:r>
     </w:p>
     <w:p>
@@ -1667,7 +1699,7 @@
     <w:link w:val="Heading1Char"/>
     <w:uiPriority w:val="9"/>
     <w:qFormat/>
-    <w:rsid w:val="00B711FA"/>
+    <w:rsid w:val="00B367F5"/>
     <w:pPr>
       <w:keepNext/>
       <w:keepLines/>
@@ -1690,7 +1722,7 @@
     <w:semiHidden/>
     <w:unhideWhenUsed/>
     <w:qFormat/>
-    <w:rsid w:val="00B711FA"/>
+    <w:rsid w:val="00B367F5"/>
     <w:pPr>
       <w:keepNext/>
       <w:keepLines/>
@@ -1713,7 +1745,7 @@
     <w:semiHidden/>
     <w:unhideWhenUsed/>
     <w:qFormat/>
-    <w:rsid w:val="00B711FA"/>
+    <w:rsid w:val="00B367F5"/>
     <w:pPr>
       <w:keepNext/>
       <w:keepLines/>
@@ -1736,7 +1768,7 @@
     <w:semiHidden/>
     <w:unhideWhenUsed/>
     <w:qFormat/>
-    <w:rsid w:val="00B711FA"/>
+    <w:rsid w:val="00B367F5"/>
     <w:pPr>
       <w:keepNext/>
       <w:keepLines/>
@@ -1759,7 +1791,7 @@
     <w:semiHidden/>
     <w:unhideWhenUsed/>
     <w:qFormat/>
-    <w:rsid w:val="00B711FA"/>
+    <w:rsid w:val="00B367F5"/>
     <w:pPr>
       <w:keepNext/>
       <w:keepLines/>
@@ -1780,7 +1812,7 @@
     <w:semiHidden/>
     <w:unhideWhenUsed/>
     <w:qFormat/>
-    <w:rsid w:val="00B711FA"/>
+    <w:rsid w:val="00B367F5"/>
     <w:pPr>
       <w:keepNext/>
       <w:keepLines/>
@@ -1803,7 +1835,7 @@
     <w:semiHidden/>
     <w:unhideWhenUsed/>
     <w:qFormat/>
-    <w:rsid w:val="00B711FA"/>
+    <w:rsid w:val="00B367F5"/>
     <w:pPr>
       <w:keepNext/>
       <w:keepLines/>
@@ -1824,7 +1856,7 @@
     <w:semiHidden/>
     <w:unhideWhenUsed/>
     <w:qFormat/>
-    <w:rsid w:val="00B711FA"/>
+    <w:rsid w:val="00B367F5"/>
     <w:pPr>
       <w:keepNext/>
       <w:keepLines/>
@@ -1847,7 +1879,7 @@
     <w:semiHidden/>
     <w:unhideWhenUsed/>
     <w:qFormat/>
-    <w:rsid w:val="00B711FA"/>
+    <w:rsid w:val="00B367F5"/>
     <w:pPr>
       <w:keepNext/>
       <w:keepLines/>
@@ -1891,7 +1923,7 @@
     <w:basedOn w:val="DefaultParagraphFont"/>
     <w:link w:val="Heading1"/>
     <w:uiPriority w:val="9"/>
-    <w:rsid w:val="00B711FA"/>
+    <w:rsid w:val="00B367F5"/>
     <w:rPr>
       <w:rFonts w:asciiTheme="majorHAnsi" w:eastAsiaTheme="majorEastAsia" w:hAnsiTheme="majorHAnsi" w:cstheme="majorBidi"/>
       <w:color w:val="0F4761" w:themeColor="accent1" w:themeShade="BF"/>
@@ -1905,7 +1937,7 @@
     <w:link w:val="Heading2"/>
     <w:uiPriority w:val="9"/>
     <w:semiHidden/>
-    <w:rsid w:val="00B711FA"/>
+    <w:rsid w:val="00B367F5"/>
     <w:rPr>
       <w:rFonts w:asciiTheme="majorHAnsi" w:eastAsiaTheme="majorEastAsia" w:hAnsiTheme="majorHAnsi" w:cstheme="majorBidi"/>
       <w:color w:val="0F4761" w:themeColor="accent1" w:themeShade="BF"/>
@@ -1919,7 +1951,7 @@
     <w:link w:val="Heading3"/>
     <w:uiPriority w:val="9"/>
     <w:semiHidden/>
-    <w:rsid w:val="00B711FA"/>
+    <w:rsid w:val="00B367F5"/>
     <w:rPr>
       <w:rFonts w:eastAsiaTheme="majorEastAsia" w:cstheme="majorBidi"/>
       <w:color w:val="0F4761" w:themeColor="accent1" w:themeShade="BF"/>
@@ -1933,7 +1965,7 @@
     <w:link w:val="Heading4"/>
     <w:uiPriority w:val="9"/>
     <w:semiHidden/>
-    <w:rsid w:val="00B711FA"/>
+    <w:rsid w:val="00B367F5"/>
     <w:rPr>
       <w:rFonts w:eastAsiaTheme="majorEastAsia" w:cstheme="majorBidi"/>
       <w:i/>
@@ -1947,7 +1979,7 @@
     <w:link w:val="Heading5"/>
     <w:uiPriority w:val="9"/>
     <w:semiHidden/>
-    <w:rsid w:val="00B711FA"/>
+    <w:rsid w:val="00B367F5"/>
     <w:rPr>
       <w:rFonts w:eastAsiaTheme="majorEastAsia" w:cstheme="majorBidi"/>
       <w:color w:val="0F4761" w:themeColor="accent1" w:themeShade="BF"/>
@@ -1959,7 +1991,7 @@
     <w:link w:val="Heading6"/>
     <w:uiPriority w:val="9"/>
     <w:semiHidden/>
-    <w:rsid w:val="00B711FA"/>
+    <w:rsid w:val="00B367F5"/>
     <w:rPr>
       <w:rFonts w:eastAsiaTheme="majorEastAsia" w:cstheme="majorBidi"/>
       <w:i/>
@@ -1973,7 +2005,7 @@
     <w:link w:val="Heading7"/>
     <w:uiPriority w:val="9"/>
     <w:semiHidden/>
-    <w:rsid w:val="00B711FA"/>
+    <w:rsid w:val="00B367F5"/>
     <w:rPr>
       <w:rFonts w:eastAsiaTheme="majorEastAsia" w:cstheme="majorBidi"/>
       <w:color w:val="595959" w:themeColor="text1" w:themeTint="A6"/>
@@ -1985,7 +2017,7 @@
     <w:link w:val="Heading8"/>
     <w:uiPriority w:val="9"/>
     <w:semiHidden/>
-    <w:rsid w:val="00B711FA"/>
+    <w:rsid w:val="00B367F5"/>
     <w:rPr>
       <w:rFonts w:eastAsiaTheme="majorEastAsia" w:cstheme="majorBidi"/>
       <w:i/>
@@ -1999,7 +2031,7 @@
     <w:link w:val="Heading9"/>
     <w:uiPriority w:val="9"/>
     <w:semiHidden/>
-    <w:rsid w:val="00B711FA"/>
+    <w:rsid w:val="00B367F5"/>
     <w:rPr>
       <w:rFonts w:eastAsiaTheme="majorEastAsia" w:cstheme="majorBidi"/>
       <w:color w:val="272727" w:themeColor="text1" w:themeTint="D8"/>
@@ -2012,7 +2044,7 @@
     <w:link w:val="TitleChar"/>
     <w:uiPriority w:val="10"/>
     <w:qFormat/>
-    <w:rsid w:val="00B711FA"/>
+    <w:rsid w:val="00B367F5"/>
     <w:pPr>
       <w:spacing w:after="80" w:line="240" w:lineRule="auto"/>
       <w:contextualSpacing/>
@@ -2030,7 +2062,7 @@
     <w:basedOn w:val="DefaultParagraphFont"/>
     <w:link w:val="Title"/>
     <w:uiPriority w:val="10"/>
-    <w:rsid w:val="00B711FA"/>
+    <w:rsid w:val="00B367F5"/>
     <w:rPr>
       <w:rFonts w:asciiTheme="majorHAnsi" w:eastAsiaTheme="majorEastAsia" w:hAnsiTheme="majorHAnsi" w:cstheme="majorBidi"/>
       <w:spacing w:val="-10"/>
@@ -2046,7 +2078,7 @@
     <w:link w:val="SubtitleChar"/>
     <w:uiPriority w:val="11"/>
     <w:qFormat/>
-    <w:rsid w:val="00B711FA"/>
+    <w:rsid w:val="00B367F5"/>
     <w:pPr>
       <w:numPr>
         <w:ilvl w:val="1"/>
@@ -2065,7 +2097,7 @@
     <w:basedOn w:val="DefaultParagraphFont"/>
     <w:link w:val="Subtitle"/>
     <w:uiPriority w:val="11"/>
-    <w:rsid w:val="00B711FA"/>
+    <w:rsid w:val="00B367F5"/>
     <w:rPr>
       <w:rFonts w:eastAsiaTheme="majorEastAsia" w:cstheme="majorBidi"/>
       <w:color w:val="595959" w:themeColor="text1" w:themeTint="A6"/>
@@ -2081,7 +2113,7 @@
     <w:link w:val="QuoteChar"/>
     <w:uiPriority w:val="29"/>
     <w:qFormat/>
-    <w:rsid w:val="00B711FA"/>
+    <w:rsid w:val="00B367F5"/>
     <w:pPr>
       <w:spacing w:before="160"/>
       <w:jc w:val="center"/>
@@ -2097,7 +2129,7 @@
     <w:basedOn w:val="DefaultParagraphFont"/>
     <w:link w:val="Quote"/>
     <w:uiPriority w:val="29"/>
-    <w:rsid w:val="00B711FA"/>
+    <w:rsid w:val="00B367F5"/>
     <w:rPr>
       <w:i/>
       <w:iCs/>
@@ -2109,7 +2141,7 @@
     <w:basedOn w:val="Normal"/>
     <w:uiPriority w:val="34"/>
     <w:qFormat/>
-    <w:rsid w:val="00B711FA"/>
+    <w:rsid w:val="00B367F5"/>
     <w:pPr>
       <w:ind w:left="720"/>
       <w:contextualSpacing/>
@@ -2120,7 +2152,7 @@
     <w:basedOn w:val="DefaultParagraphFont"/>
     <w:uiPriority w:val="21"/>
     <w:qFormat/>
-    <w:rsid w:val="00B711FA"/>
+    <w:rsid w:val="00B367F5"/>
     <w:rPr>
       <w:i/>
       <w:iCs/>
@@ -2134,7 +2166,7 @@
     <w:link w:val="IntenseQuoteChar"/>
     <w:uiPriority w:val="30"/>
     <w:qFormat/>
-    <w:rsid w:val="00B711FA"/>
+    <w:rsid w:val="00B367F5"/>
     <w:pPr>
       <w:pBdr>
         <w:top w:val="single" w:sz="4" w:space="10" w:color="0F4761" w:themeColor="accent1" w:themeShade="BF"/>
@@ -2155,7 +2187,7 @@
     <w:basedOn w:val="DefaultParagraphFont"/>
     <w:link w:val="IntenseQuote"/>
     <w:uiPriority w:val="30"/>
-    <w:rsid w:val="00B711FA"/>
+    <w:rsid w:val="00B367F5"/>
     <w:rPr>
       <w:i/>
       <w:iCs/>
@@ -2167,7 +2199,7 @@
     <w:basedOn w:val="DefaultParagraphFont"/>
     <w:uiPriority w:val="32"/>
     <w:qFormat/>
-    <w:rsid w:val="00B711FA"/>
+    <w:rsid w:val="00B367F5"/>
     <w:rPr>
       <w:b/>
       <w:bCs/>

</xml_diff>